<commit_message>
docs(defense): finalize PPTX diagram layouts, sync CI Run #40231783994 incident details into scripts and QA guides
</commit_message>
<xml_diff>
--- a/deliverables/VISIONARY_PRESENTATION_SCRIPT.docx
+++ b/deliverables/VISIONARY_PRESENTATION_SCRIPT.docx
@@ -1909,7 +1909,7 @@
           <w:color w:val="1E293B"/>
           <w:sz w:val="20"/>
         </w:rPr>
-        <w:t>"Trong quá trình xây dựng hệ thống, nhóm em đã gặp một sự cố thật rất điển hình trong pipeline CI/CD.</w:t>
+        <w:t>"Trong quá trình kiểm thử tự động, nhóm em đã đối mặt với một sự cố kỹ thuật có thật trên GitHub Actions Backend CI Run #12.</w:t>
       </w:r>
     </w:p>
     <w:p>
@@ -1921,7 +1921,7 @@
           <w:color w:val="0F172A"/>
           <w:sz w:val="20"/>
         </w:rPr>
-        <w:t>Bên trái là log lỗi nguyên văn từ GitHub Actions: NETSDK1100.</w:t>
+        <w:t>Bên trái là log lỗi nguyên văn: pipeline báo Build FAILED dù 0 lỗi biên dịch C#, với 13 bài đạt và 2 bài kiểm thử thất bại (bài Search dòng 168 và bài GetPostBySlug dòng 183).</w:t>
       </w:r>
     </w:p>
     <w:p>
@@ -1933,7 +1933,7 @@
           <w:color w:val="0F172A"/>
           <w:sz w:val="20"/>
         </w:rPr>
-        <w:t>Lỗi xảy ra vì file solution chung ban đầu chứa cả dự án Windows Forms (.NET 8 Windows Desktop). Khi đưa lên runner Ubuntu Linux của GitHub Actions để build backend, hệ điều hành Linux từ chối biên dịch các thư viện giao diện Windows.</w:t>
+        <w:t>Đi sâu vào log, nhóm phát hiện thông báo lỗi SQLite Error 19: UNIQUE constraint failed: Roles.Name.</w:t>
       </w:r>
     </w:p>
     <w:p>
@@ -1945,7 +1945,7 @@
           <w:color w:val="0F172A"/>
           <w:sz w:val="20"/>
         </w:rPr>
-        <w:t>Nhóm em đã chẩn đoán nguyên nhân và khắc phục bằng cách tách thành solution Visionary.Backend.sln độc lập chỉ chứa Core, Infrastructure, Api và Tests.</w:t>
+        <w:t>Nguyên nhân gốc rễ do xUnit kích hoạt hai class kiểm thử chạy song song, cùng khởi tạo WebApplicationFactory trỏ vào chung một file visionary.db, gây xung đột ghi đồng thời khiến chu trình nạp dữ liệu SeedAsync bị dừng đột ngột trước khi kịp nạp bài viết.</w:t>
       </w:r>
     </w:p>
     <w:p>
@@ -1957,7 +1957,7 @@
           <w:color w:val="0F172A"/>
           <w:sz w:val="20"/>
         </w:rPr>
-        <w:t>Dự án Windows Forms được biên dịch trong workflow riêng desktop.yml trên máy ảo Windows.</w:t>
+        <w:t>Nhóm em đã tự phân tích và xử lý triệt để bằng giải pháp hai tầng: Thứ nhất, đặt khóa luồng tĩnh SemaphoreSlim(1, 1) trong DbInitializer; Thứ hai, xây dựng CustomWebApplicationFactory cấp phát cơ sở dữ liệu test cô lập và gộp chung Collection kiểm thử.</w:t>
       </w:r>
     </w:p>
     <w:p>
@@ -1969,7 +1969,7 @@
           <w:color w:val="0F172A"/>
           <w:sz w:val="20"/>
         </w:rPr>
-        <w:t>Sau khi sửa, toàn bộ 15 bài kiểm thử hồi quy xUnit và 5 workflow CI đều vượt qua 100% như hình bên phải."</w:t>
+        <w:t>Như hình bên phải, toàn bộ 15/15 bài test đã vượt qua 100% và GitHub Actions Run #40231783994 trên Linux đã báo xanh hoàn toàn."</w:t>
       </w:r>
     </w:p>
     <w:p>

</xml_diff>

<commit_message>
chore(repo): complete master cleanup, test reconciliation (15/15), name standardization, and team contribution audit
</commit_message>
<xml_diff>
--- a/deliverables/VISIONARY_PRESENTATION_SCRIPT.docx
+++ b/deliverables/VISIONARY_PRESENTATION_SCRIPT.docx
@@ -288,7 +288,7 @@
               <w:rPr>
                 <w:sz w:val="20"/>
               </w:rPr>
-              <w:t>Hồ Đoàng Nguyên Khang</w:t>
+              <w:t>Hồ Đoàn Nguyên Khang</w:t>
             </w:r>
           </w:p>
         </w:tc>
@@ -450,7 +450,7 @@
           <w:color w:val="0F172A"/>
           <w:sz w:val="20"/>
         </w:rPr>
-        <w:t>Nhóm em gồm 4 thành viên: em, bạn Đào Trí Khang, bạn Hồ Đoàng Nguyên Khang và bạn Võ Ngọc Minh Đạt.</w:t>
+        <w:t>Nhóm em gồm 4 thành viên: em, bạn Đào Trí Khang, bạn Hồ Đoàn Nguyên Khang và bạn Võ Ngọc Minh Đạt.</w:t>
       </w:r>
     </w:p>
     <w:p>
@@ -1087,7 +1087,7 @@
           <w:color w:val="0F172A"/>
           <w:sz w:val="20"/>
         </w:rPr>
-        <w:t>Dữ liệu này đã được đồng bộ ngay lập tức lên hệ thống. Tiếp theo, em xin kính mời bạn Hồ Đoàng Nguyên Khang báo cáo phần Web API và Swagger."</w:t>
+        <w:t>Dữ liệu này đã được đồng bộ ngay lập tức lên hệ thống. Tiếp theo, em xin kính mời bạn Hồ Đoàn Nguyên Khang báo cáo phần Web API và Swagger."</w:t>
       </w:r>
     </w:p>
     <w:p>
@@ -1100,7 +1100,7 @@
           <w:color w:val="0F172A"/>
           <w:sz w:val="26"/>
         </w:rPr>
-        <w:t>PHẦN 3: HỒ ĐOÀNG NGUYÊN KHANG (SLIDE 8 – 11 | 4 PHÚT 15 GIÂY)</w:t>
+        <w:t>PHẦN 3: HỒ ĐOÀN NGUYÊN KHANG (SLIDE 8 – 11 | 4 PHÚT 15 GIÂY)</w:t>
       </w:r>
     </w:p>
     <w:p>
@@ -1138,7 +1138,7 @@
           <w:color w:val="1E293B"/>
           <w:sz w:val="20"/>
         </w:rPr>
-        <w:t>"Kính chào Thầy và các bạn! Em tên là Hồ Đoàng Nguyên Khang, phụ trách máy chủ Web API, tài liệu Swagger và cơ sở dữ liệu.</w:t>
+        <w:t>"Kính chào Thầy và các bạn! Em tên là Hồ Đoàn Nguyên Khang, phụ trách máy chủ Web API, tài liệu Swagger và cơ sở dữ liệu.</w:t>
       </w:r>
     </w:p>
     <w:p>

</xml_diff>